<commit_message>
Fixed alignment issues in Word layouts, reordered RDLC XML entities
</commit_message>
<xml_diff>
--- a/src/Layers/IT/BaseApp/Sales/History/StandardSalesInvoice.docx
+++ b/src/Layers/IT/BaseApp/Sales/History/StandardSalesInvoice.docx
@@ -1,18 +1,18 @@
 
 <file path=word/document.xml><?xml version="1.0" encoding="utf-8"?>
-<w:document xmlns:a="http://schemas.openxmlformats.org/drawingml/2006/main" xmlns:pic="http://schemas.openxmlformats.org/drawingml/2006/picture" xmlns:a14="http://schemas.microsoft.com/office/drawing/2010/main" xmlns:wpc="http://schemas.microsoft.com/office/word/2010/wordprocessingCanvas" xmlns:cx="http://schemas.microsoft.com/office/drawing/2014/chartex" xmlns:cx1="http://schemas.microsoft.com/office/drawing/2015/9/8/chartex" xmlns:cx2="http://schemas.microsoft.com/office/drawing/2015/10/21/chartex" xmlns:cx3="http://schemas.microsoft.com/office/drawing/2016/5/9/chartex" xmlns:cx4="http://schemas.microsoft.com/office/drawing/2016/5/10/chartex" xmlns:cx5="http://schemas.microsoft.com/office/drawing/2016/5/11/chartex" xmlns:cx6="http://schemas.microsoft.com/office/drawing/2016/5/12/chartex" xmlns:cx7="http://schemas.microsoft.com/office/drawing/2016/5/13/chartex" xmlns:cx8="http://schemas.microsoft.com/office/drawing/2016/5/14/chartex" xmlns:mc="http://schemas.openxmlformats.org/markup-compatibility/2006" xmlns:aink="http://schemas.microsoft.com/office/drawing/2016/ink" xmlns:am3d="http://schemas.microsoft.com/office/drawing/2017/model3d" xmlns:o="urn:schemas-microsoft-com:office:office" xmlns:oel="http://schemas.microsoft.com/office/2019/extlst" xmlns:r="http://schemas.openxmlformats.org/officeDocument/2006/relationships" xmlns:m="http://schemas.openxmlformats.org/officeDocument/2006/math" xmlns:v="urn:schemas-microsoft-com:vml" xmlns:wp14="http://schemas.microsoft.com/office/word/2010/wordprocessingDrawing" xmlns:wp="http://schemas.openxmlformats.org/drawingml/2006/wordprocessingDrawing" xmlns:w10="urn:schemas-microsoft-com:office:word" xmlns:w="http://schemas.openxmlformats.org/wordprocessingml/2006/main" xmlns:w14="http://schemas.microsoft.com/office/word/2010/wordml" xmlns:w15="http://schemas.microsoft.com/office/word/2012/wordml" xmlns:w16cex="http://schemas.microsoft.com/office/word/2018/wordml/cex" xmlns:w16cid="http://schemas.microsoft.com/office/word/2016/wordml/cid" xmlns:w16="http://schemas.microsoft.com/office/word/2018/wordml" xmlns:w16du="http://schemas.microsoft.com/office/word/2023/wordml/word16du" xmlns:w16sdtdh="http://schemas.microsoft.com/office/word/2020/wordml/sdtdatahash" xmlns:w16sdtfl="http://schemas.microsoft.com/office/word/2024/wordml/sdtformatlock" xmlns:w16se="http://schemas.microsoft.com/office/word/2015/wordml/symex" xmlns:wpg="http://schemas.microsoft.com/office/word/2010/wordprocessingGroup" xmlns:wpi="http://schemas.microsoft.com/office/word/2010/wordprocessingInk" xmlns:wne="http://schemas.microsoft.com/office/word/2006/wordml" xmlns:wps="http://schemas.microsoft.com/office/word/2010/wordprocessingShape" mc:Ignorable="w14 w15 w16se w16cid w16 w16cex w16sdtdh w16sdtfl w16du wp14">
+<w:document xmlns:wpc="http://schemas.microsoft.com/office/word/2010/wordprocessingCanvas" xmlns:cx="http://schemas.microsoft.com/office/drawing/2014/chartex" xmlns:cx1="http://schemas.microsoft.com/office/drawing/2015/9/8/chartex" xmlns:cx2="http://schemas.microsoft.com/office/drawing/2015/10/21/chartex" xmlns:cx3="http://schemas.microsoft.com/office/drawing/2016/5/9/chartex" xmlns:cx4="http://schemas.microsoft.com/office/drawing/2016/5/10/chartex" xmlns:cx5="http://schemas.microsoft.com/office/drawing/2016/5/11/chartex" xmlns:cx6="http://schemas.microsoft.com/office/drawing/2016/5/12/chartex" xmlns:cx7="http://schemas.microsoft.com/office/drawing/2016/5/13/chartex" xmlns:cx8="http://schemas.microsoft.com/office/drawing/2016/5/14/chartex" xmlns:mc="http://schemas.openxmlformats.org/markup-compatibility/2006" xmlns:aink="http://schemas.microsoft.com/office/drawing/2016/ink" xmlns:am3d="http://schemas.microsoft.com/office/drawing/2017/model3d" xmlns:o="urn:schemas-microsoft-com:office:office" xmlns:oel="http://schemas.microsoft.com/office/2019/extlst" xmlns:r="http://schemas.openxmlformats.org/officeDocument/2006/relationships" xmlns:m="http://schemas.openxmlformats.org/officeDocument/2006/math" xmlns:v="urn:schemas-microsoft-com:vml" xmlns:wp14="http://schemas.microsoft.com/office/word/2010/wordprocessingDrawing" xmlns:wp="http://schemas.openxmlformats.org/drawingml/2006/wordprocessingDrawing" xmlns:w10="urn:schemas-microsoft-com:office:word" xmlns:w="http://schemas.openxmlformats.org/wordprocessingml/2006/main" xmlns:w14="http://schemas.microsoft.com/office/word/2010/wordml" xmlns:w15="http://schemas.microsoft.com/office/word/2012/wordml" xmlns:w16cex="http://schemas.microsoft.com/office/word/2018/wordml/cex" xmlns:w16cid="http://schemas.microsoft.com/office/word/2016/wordml/cid" xmlns:w16="http://schemas.microsoft.com/office/word/2018/wordml" xmlns:w16du="http://schemas.microsoft.com/office/word/2023/wordml/word16du" xmlns:w16sdtdh="http://schemas.microsoft.com/office/word/2020/wordml/sdtdatahash" xmlns:w16sdtfl="http://schemas.microsoft.com/office/word/2024/wordml/sdtformatlock" xmlns:w16se="http://schemas.microsoft.com/office/word/2015/wordml/symex" xmlns:wpg="http://schemas.microsoft.com/office/word/2010/wordprocessingGroup" xmlns:wpi="http://schemas.microsoft.com/office/word/2010/wordprocessingInk" xmlns:wne="http://schemas.microsoft.com/office/word/2006/wordml" xmlns:wps="http://schemas.microsoft.com/office/word/2010/wordprocessingShape" mc:Ignorable="w14 w15 w16se w16cid w16 w16cex w16sdtdh w16sdtfl w16du wp14">
   <w:body>
     <w:tbl>
       <w:tblPr>
         <w:tblStyle w:val="TableGrid"/>
         <w:tblW w:w="5000" w:type="pct"/>
         <w:tblBorders>
-          <w:top w:val="none" w:color="auto" w:sz="0" w:space="0"/>
-          <w:left w:val="none" w:color="auto" w:sz="0" w:space="0"/>
-          <w:bottom w:val="none" w:color="auto" w:sz="0" w:space="0"/>
-          <w:right w:val="none" w:color="auto" w:sz="0" w:space="0"/>
-          <w:insideH w:val="none" w:color="auto" w:sz="0" w:space="0"/>
-          <w:insideV w:val="none" w:color="auto" w:sz="0" w:space="0"/>
+          <w:top w:val="none" w:sz="0" w:space="0" w:color="auto"/>
+          <w:left w:val="none" w:sz="0" w:space="0" w:color="auto"/>
+          <w:bottom w:val="none" w:sz="0" w:space="0" w:color="auto"/>
+          <w:right w:val="none" w:sz="0" w:space="0" w:color="auto"/>
+          <w:insideH w:val="none" w:sz="0" w:space="0" w:color="auto"/>
+          <w:insideV w:val="none" w:sz="0" w:space="0" w:color="auto"/>
         </w:tblBorders>
         <w:tblCellMar>
           <w:left w:w="0" w:type="dxa"/>
@@ -588,12 +588,12 @@
         <w:tblStyle w:val="TableGrid"/>
         <w:tblW w:w="0" w:type="auto"/>
         <w:tblBorders>
-          <w:top w:val="none" w:color="auto" w:sz="0" w:space="0"/>
-          <w:left w:val="none" w:color="auto" w:sz="0" w:space="0"/>
-          <w:bottom w:val="none" w:color="auto" w:sz="0" w:space="0"/>
-          <w:right w:val="none" w:color="auto" w:sz="0" w:space="0"/>
-          <w:insideH w:val="none" w:color="auto" w:sz="0" w:space="0"/>
-          <w:insideV w:val="none" w:color="auto" w:sz="0" w:space="0"/>
+          <w:top w:val="none" w:sz="0" w:space="0" w:color="auto"/>
+          <w:left w:val="none" w:sz="0" w:space="0" w:color="auto"/>
+          <w:bottom w:val="none" w:sz="0" w:space="0" w:color="auto"/>
+          <w:right w:val="none" w:sz="0" w:space="0" w:color="auto"/>
+          <w:insideH w:val="none" w:sz="0" w:space="0" w:color="auto"/>
+          <w:insideV w:val="none" w:sz="0" w:space="0" w:color="auto"/>
         </w:tblBorders>
         <w:tblLayout w:type="fixed"/>
         <w:tblCellMar>
@@ -814,11 +814,9 @@
                 <w:tcW w:w="2549" w:type="dxa"/>
               </w:tcPr>
               <w:p>
-                <w:proofErr w:type="spellStart"/>
                 <w:r>
                   <w:t>DueDateDisplayText</w:t>
                 </w:r>
-                <w:proofErr w:type="spellEnd"/>
               </w:p>
             </w:tc>
           </w:sdtContent>
@@ -875,11 +873,9 @@
                 <w:pPr>
                   <w:pStyle w:val="Heading1"/>
                 </w:pPr>
-                <w:proofErr w:type="spellStart"/>
                 <w:r>
                   <w:t>OrderNo_Lbl</w:t>
                 </w:r>
-                <w:proofErr w:type="spellEnd"/>
               </w:p>
             </w:tc>
           </w:sdtContent>
@@ -904,11 +900,9 @@
                 <w:pPr>
                   <w:pStyle w:val="Heading1"/>
                 </w:pPr>
-                <w:proofErr w:type="spellStart"/>
                 <w:r>
                   <w:t>ShipmentMethodDescription_Lbl</w:t>
                 </w:r>
-                <w:proofErr w:type="spellEnd"/>
               </w:p>
             </w:tc>
           </w:sdtContent>
@@ -933,11 +927,9 @@
                 <w:pPr>
                   <w:pStyle w:val="Heading1"/>
                 </w:pPr>
-                <w:proofErr w:type="spellStart"/>
                 <w:r>
                   <w:t>PaymentMethodDescription_Lbl</w:t>
                 </w:r>
-                <w:proofErr w:type="spellEnd"/>
               </w:p>
             </w:tc>
           </w:sdtContent>
@@ -965,11 +957,9 @@
                 <w:pPr>
                   <w:pStyle w:val="Heading1"/>
                 </w:pPr>
-                <w:proofErr w:type="spellStart"/>
                 <w:r>
                   <w:t>PaymentReference_Lbl</w:t>
                 </w:r>
-                <w:proofErr w:type="spellEnd"/>
               </w:p>
             </w:tc>
           </w:sdtContent>
@@ -1109,7 +1099,7 @@
             <w:placeholder>
               <w:docPart w:val="DefaultPlaceholder_-1854013440"/>
             </w:placeholder>
-            <w15:dataBinding w:prefixMappings="xmlns:ns0='urn:microsoft-dynamics-nav/reports/Standard_Sales_Invoice/1306/' " w:xpath="/ns0:NavWordReportXmlPart[1]/ns0:Header[1]/ns0:ShippingAgentCode_Lbl[1]" w:storeItemID="{AF7A6226-6056-400F-ADDA-E1ADA7C08250}" w16sdtdh:storeItemChecksum="K6EqSw=="/>
+            <w15:dataBinding w:prefixMappings="xmlns:ns0='urn:microsoft-dynamics-nav/reports/Standard_Sales_Invoice/1306/' " w:xpath="/ns0:NavWordReportXmlPart[1]/ns0:Header[1]/ns0:ShippingAgentCode_Lbl[1]" w:storeItemID="{AF7A6226-6056-400F-ADDA-E1ADA7C08250}" w16sdtdh:storeItemChecksum="6K7uZQ=="/>
           </w:sdtPr>
           <w:sdtContent>
             <w:tc>
@@ -1125,7 +1115,6 @@
                     <w:szCs w:val="18"/>
                   </w:rPr>
                 </w:pPr>
-                <w:proofErr w:type="spellStart"/>
                 <w:r>
                   <w:rPr>
                     <w:b/>
@@ -1134,7 +1123,6 @@
                   </w:rPr>
                   <w:t>ShippingAgentCode_Lbl</w:t>
                 </w:r>
-                <w:proofErr w:type="spellEnd"/>
               </w:p>
             </w:tc>
           </w:sdtContent>
@@ -1151,7 +1139,7 @@
             <w:placeholder>
               <w:docPart w:val="DefaultPlaceholder_-1854013440"/>
             </w:placeholder>
-            <w15:dataBinding w:prefixMappings="xmlns:ns0='urn:microsoft-dynamics-nav/reports/Standard_Sales_Invoice/1306/' " w:xpath="/ns0:NavWordReportXmlPart[1]/ns0:Header[1]/ns0:PackageTrackingNo_Lbl[1]" w:storeItemID="{AF7A6226-6056-400F-ADDA-E1ADA7C08250}" w16sdtdh:storeItemChecksum="K6EqSw=="/>
+            <w15:dataBinding w:prefixMappings="xmlns:ns0='urn:microsoft-dynamics-nav/reports/Standard_Sales_Invoice/1306/' " w:xpath="/ns0:NavWordReportXmlPart[1]/ns0:Header[1]/ns0:PackageTrackingNo_Lbl[1]" w:storeItemID="{AF7A6226-6056-400F-ADDA-E1ADA7C08250}" w16sdtdh:storeItemChecksum="6K7uZQ=="/>
           </w:sdtPr>
           <w:sdtContent>
             <w:tc>
@@ -1210,7 +1198,6 @@
                     <w:lang w:val="da-DK"/>
                   </w:rPr>
                 </w:pPr>
-                <w:proofErr w:type="spellStart"/>
                 <w:r>
                   <w:rPr>
                     <w:b/>
@@ -1219,7 +1206,6 @@
                   </w:rPr>
                   <w:t>JobNo_Lbl</w:t>
                 </w:r>
-                <w:proofErr w:type="spellEnd"/>
               </w:p>
             </w:tc>
           </w:sdtContent>
@@ -1248,7 +1234,7 @@
             <w:placeholder>
               <w:docPart w:val="DefaultPlaceholder_-1854013440"/>
             </w:placeholder>
-            <w15:dataBinding w:prefixMappings="xmlns:ns0='urn:microsoft-dynamics-nav/reports/Standard_Sales_Invoice/1306/' " w:xpath="/ns0:NavWordReportXmlPart[1]/ns0:Header[1]/ns0:ShippingAgentCode[1]" w:storeItemID="{AF7A6226-6056-400F-ADDA-E1ADA7C08250}" w16sdtdh:storeItemChecksum="K6EqSw=="/>
+            <w15:dataBinding w:prefixMappings="xmlns:ns0='urn:microsoft-dynamics-nav/reports/Standard_Sales_Invoice/1306/' " w:xpath="/ns0:NavWordReportXmlPart[1]/ns0:Header[1]/ns0:ShippingAgentCode[1]" w:storeItemID="{AF7A6226-6056-400F-ADDA-E1ADA7C08250}" w16sdtdh:storeItemChecksum="6K7uZQ=="/>
           </w:sdtPr>
           <w:sdtContent>
             <w:tc>
@@ -1256,11 +1242,9 @@
                 <w:tcW w:w="2549" w:type="dxa"/>
               </w:tcPr>
               <w:p>
-                <w:proofErr w:type="spellStart"/>
                 <w:r>
                   <w:t>ShippingAgentCode</w:t>
                 </w:r>
-                <w:proofErr w:type="spellEnd"/>
               </w:p>
             </w:tc>
           </w:sdtContent>
@@ -1274,7 +1258,7 @@
             <w:placeholder>
               <w:docPart w:val="DefaultPlaceholder_-1854013440"/>
             </w:placeholder>
-            <w15:dataBinding w:prefixMappings="xmlns:ns0='urn:microsoft-dynamics-nav/reports/Standard_Sales_Invoice/1306/' " w:xpath="/ns0:NavWordReportXmlPart[1]/ns0:Header[1]/ns0:PackageTrackingNo[1]" w:storeItemID="{AF7A6226-6056-400F-ADDA-E1ADA7C08250}" w16sdtdh:storeItemChecksum="K6EqSw=="/>
+            <w15:dataBinding w:prefixMappings="xmlns:ns0='urn:microsoft-dynamics-nav/reports/Standard_Sales_Invoice/1306/' " w:xpath="/ns0:NavWordReportXmlPart[1]/ns0:Header[1]/ns0:PackageTrackingNo[1]" w:storeItemID="{AF7A6226-6056-400F-ADDA-E1ADA7C08250}" w16sdtdh:storeItemChecksum="6K7uZQ=="/>
           </w:sdtPr>
           <w:sdtContent>
             <w:tc>
@@ -1322,11 +1306,9 @@
                     <w:lang w:val="da-DK"/>
                   </w:rPr>
                 </w:pPr>
-                <w:proofErr w:type="spellStart"/>
                 <w:r>
                   <w:t>JobNo</w:t>
                 </w:r>
-                <w:proofErr w:type="spellEnd"/>
               </w:p>
             </w:tc>
           </w:sdtContent>
@@ -1435,7 +1417,7 @@
               <w:tcPr>
                 <w:tcW w:w="954" w:type="dxa"/>
                 <w:tcBorders>
-                  <w:bottom w:val="single" w:color="auto" w:sz="4" w:space="0"/>
+                  <w:bottom w:val="single" w:sz="4" w:space="0" w:color="auto"/>
                 </w:tcBorders>
                 <w:vAlign w:val="bottom"/>
               </w:tcPr>
@@ -1469,7 +1451,7 @@
               <w:tcPr>
                 <w:tcW w:w="2268" w:type="dxa"/>
                 <w:tcBorders>
-                  <w:bottom w:val="single" w:color="auto" w:sz="4" w:space="0"/>
+                  <w:bottom w:val="single" w:sz="4" w:space="0" w:color="auto"/>
                 </w:tcBorders>
                 <w:vAlign w:val="bottom"/>
               </w:tcPr>
@@ -1503,7 +1485,7 @@
               <w:tcPr>
                 <w:tcW w:w="1021" w:type="dxa"/>
                 <w:tcBorders>
-                  <w:bottom w:val="single" w:color="auto" w:sz="4" w:space="0"/>
+                  <w:bottom w:val="single" w:sz="4" w:space="0" w:color="auto"/>
                 </w:tcBorders>
                 <w:vAlign w:val="bottom"/>
               </w:tcPr>
@@ -1537,7 +1519,7 @@
               <w:tcPr>
                 <w:tcW w:w="907" w:type="dxa"/>
                 <w:tcBorders>
-                  <w:bottom w:val="single" w:color="auto" w:sz="4" w:space="0"/>
+                  <w:bottom w:val="single" w:sz="4" w:space="0" w:color="auto"/>
                 </w:tcBorders>
                 <w:vAlign w:val="bottom"/>
               </w:tcPr>
@@ -1560,7 +1542,7 @@
           <w:tcPr>
             <w:tcW w:w="680" w:type="dxa"/>
             <w:tcBorders>
-              <w:bottom w:val="single" w:color="auto" w:sz="4" w:space="0"/>
+              <w:bottom w:val="single" w:sz="4" w:space="0" w:color="auto"/>
             </w:tcBorders>
             <w:vAlign w:val="bottom"/>
           </w:tcPr>
@@ -1586,7 +1568,7 @@
               <w:tcPr>
                 <w:tcW w:w="1365" w:type="dxa"/>
                 <w:tcBorders>
-                  <w:bottom w:val="single" w:color="auto" w:sz="4" w:space="0"/>
+                  <w:bottom w:val="single" w:sz="4" w:space="0" w:color="auto"/>
                 </w:tcBorders>
                 <w:vAlign w:val="bottom"/>
               </w:tcPr>
@@ -1609,7 +1591,7 @@
           <w:tcPr>
             <w:tcW w:w="620" w:type="dxa"/>
             <w:tcBorders>
-              <w:bottom w:val="single" w:color="auto" w:sz="4" w:space="0"/>
+              <w:bottom w:val="single" w:sz="4" w:space="0" w:color="auto"/>
             </w:tcBorders>
             <w:vAlign w:val="bottom"/>
           </w:tcPr>
@@ -1635,7 +1617,7 @@
               <w:tcPr>
                 <w:tcW w:w="709" w:type="dxa"/>
                 <w:tcBorders>
-                  <w:bottom w:val="single" w:color="auto" w:sz="4" w:space="0"/>
+                  <w:bottom w:val="single" w:sz="4" w:space="0" w:color="auto"/>
                 </w:tcBorders>
                 <w:vAlign w:val="bottom"/>
               </w:tcPr>
@@ -1670,7 +1652,7 @@
               <w:tcPr>
                 <w:tcW w:w="1682" w:type="dxa"/>
                 <w:tcBorders>
-                  <w:bottom w:val="single" w:color="auto" w:sz="4" w:space="0"/>
+                  <w:bottom w:val="single" w:sz="4" w:space="0" w:color="auto"/>
                 </w:tcBorders>
                 <w:tcMar>
                   <w:right w:w="0" w:type="dxa"/>
@@ -1702,7 +1684,7 @@
           <w:tcPr>
             <w:tcW w:w="954" w:type="dxa"/>
             <w:tcBorders>
-              <w:top w:val="single" w:color="auto" w:sz="4" w:space="0"/>
+              <w:top w:val="single" w:sz="4" w:space="0" w:color="auto"/>
             </w:tcBorders>
           </w:tcPr>
           <w:p>
@@ -1719,7 +1701,7 @@
           <w:tcPr>
             <w:tcW w:w="2268" w:type="dxa"/>
             <w:tcBorders>
-              <w:top w:val="single" w:color="auto" w:sz="4" w:space="0"/>
+              <w:top w:val="single" w:sz="4" w:space="0" w:color="auto"/>
             </w:tcBorders>
           </w:tcPr>
           <w:p>
@@ -1736,7 +1718,7 @@
           <w:tcPr>
             <w:tcW w:w="1021" w:type="dxa"/>
             <w:tcBorders>
-              <w:top w:val="single" w:color="auto" w:sz="4" w:space="0"/>
+              <w:top w:val="single" w:sz="4" w:space="0" w:color="auto"/>
             </w:tcBorders>
           </w:tcPr>
           <w:p>
@@ -1753,7 +1735,7 @@
           <w:tcPr>
             <w:tcW w:w="907" w:type="dxa"/>
             <w:tcBorders>
-              <w:top w:val="single" w:color="auto" w:sz="4" w:space="0"/>
+              <w:top w:val="single" w:sz="4" w:space="0" w:color="auto"/>
             </w:tcBorders>
           </w:tcPr>
           <w:p>
@@ -1770,7 +1752,7 @@
           <w:tcPr>
             <w:tcW w:w="680" w:type="dxa"/>
             <w:tcBorders>
-              <w:top w:val="single" w:color="auto" w:sz="4" w:space="0"/>
+              <w:top w:val="single" w:sz="4" w:space="0" w:color="auto"/>
             </w:tcBorders>
           </w:tcPr>
           <w:p>
@@ -1787,7 +1769,7 @@
           <w:tcPr>
             <w:tcW w:w="1365" w:type="dxa"/>
             <w:tcBorders>
-              <w:top w:val="single" w:color="auto" w:sz="4" w:space="0"/>
+              <w:top w:val="single" w:sz="4" w:space="0" w:color="auto"/>
             </w:tcBorders>
           </w:tcPr>
           <w:p>
@@ -1804,7 +1786,7 @@
           <w:tcPr>
             <w:tcW w:w="620" w:type="dxa"/>
             <w:tcBorders>
-              <w:top w:val="single" w:color="auto" w:sz="4" w:space="0"/>
+              <w:top w:val="single" w:sz="4" w:space="0" w:color="auto"/>
             </w:tcBorders>
           </w:tcPr>
           <w:p>
@@ -1821,7 +1803,7 @@
           <w:tcPr>
             <w:tcW w:w="709" w:type="dxa"/>
             <w:tcBorders>
-              <w:top w:val="single" w:color="auto" w:sz="4" w:space="0"/>
+              <w:top w:val="single" w:sz="4" w:space="0" w:color="auto"/>
             </w:tcBorders>
           </w:tcPr>
           <w:p>
@@ -1838,7 +1820,7 @@
           <w:tcPr>
             <w:tcW w:w="1682" w:type="dxa"/>
             <w:tcBorders>
-              <w:top w:val="single" w:color="auto" w:sz="4" w:space="0"/>
+              <w:top w:val="single" w:sz="4" w:space="0" w:color="auto"/>
             </w:tcBorders>
             <w:tcMar>
               <w:right w:w="0" w:type="dxa"/>
@@ -2689,7 +2671,7 @@
                 <w:tcW w:w="2694" w:type="dxa"/>
                 <w:gridSpan w:val="3"/>
                 <w:tcBorders>
-                  <w:bottom w:val="single" w:color="auto" w:sz="4" w:space="0"/>
+                  <w:bottom w:val="single" w:sz="4" w:space="0" w:color="auto"/>
                 </w:tcBorders>
               </w:tcPr>
               <w:p>
@@ -2699,14 +2681,12 @@
                     <w:b/>
                   </w:rPr>
                 </w:pPr>
-                <w:proofErr w:type="spellStart"/>
                 <w:r>
                   <w:rPr>
                     <w:b/>
                   </w:rPr>
                   <w:t>TotalAmountExclInclVATText</w:t>
                 </w:r>
-                <w:proofErr w:type="spellEnd"/>
               </w:p>
             </w:tc>
           </w:sdtContent>
@@ -2730,7 +2710,7 @@
               <w:tcPr>
                 <w:tcW w:w="1682" w:type="dxa"/>
                 <w:tcBorders>
-                  <w:bottom w:val="single" w:color="auto" w:sz="4" w:space="0"/>
+                  <w:bottom w:val="single" w:sz="4" w:space="0" w:color="auto"/>
                 </w:tcBorders>
                 <w:tcMar>
                   <w:right w:w="0" w:type="dxa"/>
@@ -2744,14 +2724,12 @@
                     <w:b/>
                   </w:rPr>
                 </w:pPr>
-                <w:proofErr w:type="spellStart"/>
                 <w:r>
                   <w:rPr>
                     <w:b/>
                   </w:rPr>
                   <w:t>TotalAmountExclInclVAT</w:t>
                 </w:r>
-                <w:proofErr w:type="spellEnd"/>
               </w:p>
             </w:tc>
           </w:sdtContent>
@@ -2817,7 +2795,7 @@
             <w:tcW w:w="2694" w:type="dxa"/>
             <w:gridSpan w:val="3"/>
             <w:tcBorders>
-              <w:top w:val="single" w:color="auto" w:sz="4" w:space="0"/>
+              <w:top w:val="single" w:sz="4" w:space="0" w:color="auto"/>
             </w:tcBorders>
           </w:tcPr>
           <w:p>
@@ -2833,7 +2811,7 @@
           <w:tcPr>
             <w:tcW w:w="1682" w:type="dxa"/>
             <w:tcBorders>
-              <w:top w:val="single" w:color="auto" w:sz="4" w:space="0"/>
+              <w:top w:val="single" w:sz="4" w:space="0" w:color="auto"/>
             </w:tcBorders>
             <w:tcMar>
               <w:right w:w="0" w:type="dxa"/>
@@ -2910,14 +2888,14 @@
             <w:rPr>
               <w:b/>
             </w:rPr>
+            <w:alias w:val="#Nav: /Header/PostedPaymentSchedule_Lbl"/>
+            <w:tag w:val="#Nav: Standard_Sales_Invoice/1306"/>
             <w:id w:val="125357895"/>
             <w:placeholder>
               <w:docPart w:val="DefaultPlaceholder_-1854013440"/>
             </w:placeholder>
             <w:dataBinding w:prefixMappings="xmlns:ns0='urn:microsoft-dynamics-nav/reports/Standard_Sales_Invoice/1306/'" w:xpath="/ns0:NavWordReportXmlPart[1]/ns0:Header[1]/ns0:PostedPaymentSchedule_Lbl[1]" w:storeItemID="{AF7A6226-6056-400F-ADDA-E1ADA7C08250}"/>
             <w:text/>
-            <w:alias w:val="#Nav: /Header/PostedPaymentSchedule_Lbl"/>
-            <w:tag w:val="#Nav: Standard_Sales_Invoice/1306"/>
           </w:sdtPr>
           <w:sdtContent>
             <w:tc>
@@ -2932,14 +2910,12 @@
                     <w:b/>
                   </w:rPr>
                 </w:pPr>
-                <w:proofErr w:type="spellStart"/>
                 <w:r>
                   <w:rPr>
                     <w:b/>
                   </w:rPr>
                   <w:t>PostedPaymentSchedule_Lbl</w:t>
                 </w:r>
-                <w:proofErr w:type="spellEnd"/>
               </w:p>
             </w:tc>
           </w:sdtContent>
@@ -3005,14 +2981,14 @@
             <w:rPr>
               <w:b/>
             </w:rPr>
+            <w:alias w:val="#Nav: /Header/PostedPaymentLineDueDate_Lbl"/>
+            <w:tag w:val="#Nav: Standard_Sales_Invoice/1306"/>
             <w:id w:val="-820961676"/>
             <w:placeholder>
               <w:docPart w:val="DefaultPlaceholder_-1854013440"/>
             </w:placeholder>
             <w:dataBinding w:prefixMappings="xmlns:ns0='urn:microsoft-dynamics-nav/reports/Standard_Sales_Invoice/1306/'" w:xpath="/ns0:NavWordReportXmlPart[1]/ns0:Header[1]/ns0:PostedPaymentLineDueDate_Lbl[1]" w:storeItemID="{AF7A6226-6056-400F-ADDA-E1ADA7C08250}"/>
             <w:text/>
-            <w:alias w:val="#Nav: /Header/PostedPaymentLineDueDate_Lbl"/>
-            <w:tag w:val="#Nav: Standard_Sales_Invoice/1306"/>
           </w:sdtPr>
           <w:sdtContent>
             <w:tc>
@@ -3027,14 +3003,12 @@
                     <w:b/>
                   </w:rPr>
                 </w:pPr>
-                <w:proofErr w:type="spellStart"/>
                 <w:r>
                   <w:rPr>
                     <w:b/>
                   </w:rPr>
                   <w:t>PostedPaymentLineDueDate_Lbl</w:t>
                 </w:r>
-                <w:proofErr w:type="spellEnd"/>
               </w:p>
             </w:tc>
           </w:sdtContent>
@@ -3044,14 +3018,14 @@
             <w:rPr>
               <w:b/>
             </w:rPr>
+            <w:alias w:val="#Nav: /Header/PostedPaymentLineAmount_Lbl"/>
+            <w:tag w:val="#Nav: Standard_Sales_Invoice/1306"/>
             <w:id w:val="726959397"/>
             <w:placeholder>
               <w:docPart w:val="DefaultPlaceholder_-1854013440"/>
             </w:placeholder>
             <w:dataBinding w:prefixMappings="xmlns:ns0='urn:microsoft-dynamics-nav/reports/Standard_Sales_Invoice/1306/'" w:xpath="/ns0:NavWordReportXmlPart[1]/ns0:Header[1]/ns0:PostedPaymentLineAmount_Lbl[1]" w:storeItemID="{AF7A6226-6056-400F-ADDA-E1ADA7C08250}"/>
             <w:text/>
-            <w:alias w:val="#Nav: /Header/PostedPaymentLineAmount_Lbl"/>
-            <w:tag w:val="#Nav: Standard_Sales_Invoice/1306"/>
           </w:sdtPr>
           <w:sdtContent>
             <w:tc>
@@ -3064,18 +3038,17 @@
               <w:p>
                 <w:pPr>
                   <w:pStyle w:val="NoSpacing"/>
+                  <w:jc w:val="right"/>
                   <w:rPr>
                     <w:b/>
                   </w:rPr>
                 </w:pPr>
-                <w:proofErr w:type="spellStart"/>
                 <w:r>
                   <w:rPr>
                     <w:b/>
                   </w:rPr>
                   <w:t>PostedPaymentLineAmount_Lbl</w:t>
                 </w:r>
-                <w:proofErr w:type="spellEnd"/>
               </w:p>
             </w:tc>
           </w:sdtContent>
@@ -3083,11 +3056,11 @@
       </w:tr>
       <w:sdt>
         <w:sdtPr>
+          <w:alias w:val="#Nav: /Header/PostedPaymentLine"/>
+          <w:tag w:val="#Nav: Standard_Sales_Invoice/1306"/>
           <w:id w:val="910809818"/>
           <w15:dataBinding w:prefixMappings="xmlns:ns0='urn:microsoft-dynamics-nav/reports/Standard_Sales_Invoice/1306/' " w:xpath="/ns0:NavWordReportXmlPart[1]/ns0:Header[1]/ns0:PostedPaymentLine" w:storeItemID="{AF7A6226-6056-400F-ADDA-E1ADA7C08250}"/>
           <w15:repeatingSection/>
-          <w:alias w:val="#Nav: /Header/PostedPaymentLine"/>
-          <w:tag w:val="#Nav: Standard_Sales_Invoice/1306"/>
         </w:sdtPr>
         <w:sdtEndPr>
           <w:rPr>
@@ -3169,14 +3142,14 @@
                     <w:rPr>
                       <w:bCs/>
                     </w:rPr>
+                    <w:alias w:val="#Nav: /Header/PostedPaymentLine/PostedPaymentLineDueDate"/>
+                    <w:tag w:val="#Nav: Standard_Sales_Invoice/1306"/>
                     <w:id w:val="-1910216098"/>
                     <w:placeholder>
                       <w:docPart w:val="DefaultPlaceholder_-1854013440"/>
                     </w:placeholder>
                     <w:dataBinding w:prefixMappings="xmlns:ns0='urn:microsoft-dynamics-nav/reports/Standard_Sales_Invoice/1306/'" w:xpath="/ns0:NavWordReportXmlPart[1]/ns0:Header[1]/ns0:PostedPaymentLine[1]/ns0:PostedPaymentLineDueDate[1]" w:storeItemID="{AF7A6226-6056-400F-ADDA-E1ADA7C08250}"/>
                     <w:text/>
-                    <w:alias w:val="#Nav: /Header/PostedPaymentLine/PostedPaymentLineDueDate"/>
-                    <w:tag w:val="#Nav: Standard_Sales_Invoice/1306"/>
                   </w:sdtPr>
                   <w:sdtContent>
                     <w:tc>
@@ -3191,14 +3164,12 @@
                             <w:bCs/>
                           </w:rPr>
                         </w:pPr>
-                        <w:proofErr w:type="spellStart"/>
                         <w:r>
                           <w:rPr>
                             <w:bCs/>
                           </w:rPr>
                           <w:t>PostedPaymentLineDueDate</w:t>
                         </w:r>
-                        <w:proofErr w:type="spellEnd"/>
                       </w:p>
                     </w:tc>
                   </w:sdtContent>
@@ -3208,14 +3179,14 @@
                     <w:rPr>
                       <w:bCs/>
                     </w:rPr>
+                    <w:alias w:val="#Nav: /Header/PostedPaymentLine/PostedPaymentLineAmountFormatted"/>
+                    <w:tag w:val="#Nav: Standard_Sales_Invoice/1306"/>
                     <w:id w:val="-1516222185"/>
                     <w:placeholder>
                       <w:docPart w:val="DefaultPlaceholder_-1854013440"/>
                     </w:placeholder>
                     <w:dataBinding w:prefixMappings="xmlns:ns0='urn:microsoft-dynamics-nav/reports/Standard_Sales_Invoice/1306/'" w:xpath="/ns0:NavWordReportXmlPart[1]/ns0:Header[1]/ns0:PostedPaymentLine[1]/ns0:PostedPaymentLineAmountFormatted[1]" w:storeItemID="{AF7A6226-6056-400F-ADDA-E1ADA7C08250}"/>
                     <w:text/>
-                    <w:alias w:val="#Nav: /Header/PostedPaymentLine/PostedPaymentLineAmountFormatted"/>
-                    <w:tag w:val="#Nav: Standard_Sales_Invoice/1306"/>
                   </w:sdtPr>
                   <w:sdtContent>
                     <w:tc>
@@ -3228,18 +3199,17 @@
                       <w:p>
                         <w:pPr>
                           <w:pStyle w:val="NoSpacing"/>
+                          <w:jc w:val="right"/>
                           <w:rPr>
                             <w:bCs/>
                           </w:rPr>
                         </w:pPr>
-                        <w:proofErr w:type="spellStart"/>
                         <w:r>
                           <w:rPr>
                             <w:bCs/>
                           </w:rPr>
                           <w:t>PostedPaymentLineAmountFormatted</w:t>
                         </w:r>
-                        <w:proofErr w:type="spellEnd"/>
                       </w:p>
                     </w:tc>
                   </w:sdtContent>
@@ -3300,12 +3270,12 @@
         <w:tblW w:w="0" w:type="auto"/>
         <w:jc w:val="right"/>
         <w:tblBorders>
-          <w:top w:val="none" w:color="auto" w:sz="0" w:space="0"/>
-          <w:left w:val="none" w:color="auto" w:sz="0" w:space="0"/>
-          <w:bottom w:val="none" w:color="auto" w:sz="0" w:space="0"/>
-          <w:right w:val="none" w:color="auto" w:sz="0" w:space="0"/>
-          <w:insideH w:val="none" w:color="auto" w:sz="0" w:space="0"/>
-          <w:insideV w:val="none" w:color="auto" w:sz="0" w:space="0"/>
+          <w:top w:val="none" w:sz="0" w:space="0" w:color="auto"/>
+          <w:left w:val="none" w:sz="0" w:space="0" w:color="auto"/>
+          <w:bottom w:val="none" w:sz="0" w:space="0" w:color="auto"/>
+          <w:right w:val="none" w:sz="0" w:space="0" w:color="auto"/>
+          <w:insideH w:val="none" w:sz="0" w:space="0" w:color="auto"/>
+          <w:insideV w:val="none" w:sz="0" w:space="0" w:color="auto"/>
         </w:tblBorders>
         <w:tblLayout w:type="fixed"/>
         <w:tblCellMar>
@@ -3357,7 +3327,6 @@
                     <w:szCs w:val="20"/>
                   </w:rPr>
                 </w:pPr>
-                <w:proofErr w:type="spellStart"/>
                 <w:r>
                   <w:rPr>
                     <w:b/>
@@ -3366,7 +3335,6 @@
                   </w:rPr>
                   <w:t>VATClauses_Lbl</w:t>
                 </w:r>
-                <w:proofErr w:type="spellEnd"/>
               </w:p>
             </w:tc>
           </w:sdtContent>
@@ -3414,7 +3382,7 @@
                 <w:tcW w:w="7938" w:type="dxa"/>
                 <w:gridSpan w:val="2"/>
                 <w:tcBorders>
-                  <w:bottom w:val="single" w:color="auto" w:sz="4" w:space="0"/>
+                  <w:bottom w:val="single" w:sz="4" w:space="0" w:color="auto"/>
                 </w:tcBorders>
                 <w:vAlign w:val="center"/>
               </w:tcPr>
@@ -3428,7 +3396,6 @@
                     <w:szCs w:val="20"/>
                   </w:rPr>
                 </w:pPr>
-                <w:proofErr w:type="spellStart"/>
                 <w:r>
                   <w:rPr>
                     <w:b/>
@@ -3437,7 +3404,6 @@
                   </w:rPr>
                   <w:t>VATIdentifier_Lbl</w:t>
                 </w:r>
-                <w:proofErr w:type="spellEnd"/>
               </w:p>
             </w:tc>
           </w:sdtContent>
@@ -3446,7 +3412,7 @@
           <w:tcPr>
             <w:tcW w:w="2258" w:type="dxa"/>
             <w:tcBorders>
-              <w:bottom w:val="single" w:color="auto" w:sz="4" w:space="0"/>
+              <w:bottom w:val="single" w:sz="4" w:space="0" w:color="auto"/>
             </w:tcBorders>
           </w:tcPr>
           <w:p>
@@ -3488,12 +3454,12 @@
               <w:tr>
                 <w:tblPrEx>
                   <w:tblBorders>
-                    <w:top w:val="single" w:color="auto" w:sz="4" w:space="0"/>
-                    <w:left w:val="single" w:color="auto" w:sz="4" w:space="0"/>
-                    <w:bottom w:val="single" w:color="auto" w:sz="4" w:space="0"/>
-                    <w:right w:val="single" w:color="auto" w:sz="4" w:space="0"/>
-                    <w:insideH w:val="single" w:color="auto" w:sz="4" w:space="0"/>
-                    <w:insideV w:val="single" w:color="auto" w:sz="4" w:space="0"/>
+                    <w:top w:val="single" w:sz="4" w:space="0" w:color="auto"/>
+                    <w:left w:val="single" w:sz="4" w:space="0" w:color="auto"/>
+                    <w:bottom w:val="single" w:sz="4" w:space="0" w:color="auto"/>
+                    <w:right w:val="single" w:sz="4" w:space="0" w:color="auto"/>
+                    <w:insideH w:val="single" w:sz="4" w:space="0" w:color="auto"/>
+                    <w:insideV w:val="single" w:sz="4" w:space="0" w:color="auto"/>
                   </w:tblBorders>
                   <w:tblCellMar>
                     <w:left w:w="108" w:type="dxa"/>
@@ -3534,14 +3500,12 @@
                             <w:sz w:val="18"/>
                           </w:rPr>
                         </w:pPr>
-                        <w:proofErr w:type="spellStart"/>
                         <w:r>
                           <w:rPr>
                             <w:sz w:val="18"/>
                           </w:rPr>
                           <w:t>VATIdentifier_VATClauseLine</w:t>
                         </w:r>
-                        <w:proofErr w:type="spellEnd"/>
                       </w:p>
                     </w:tc>
                   </w:sdtContent>
@@ -3577,14 +3541,12 @@
                             <w:sz w:val="18"/>
                           </w:rPr>
                         </w:pPr>
-                        <w:proofErr w:type="spellStart"/>
                         <w:r>
                           <w:rPr>
                             <w:sz w:val="18"/>
                           </w:rPr>
                           <w:t>Description_VATClauseLine</w:t>
                         </w:r>
-                        <w:proofErr w:type="spellEnd"/>
                       </w:p>
                     </w:tc>
                   </w:sdtContent>
@@ -3620,14 +3582,12 @@
                             <w:sz w:val="18"/>
                           </w:rPr>
                         </w:pPr>
-                        <w:proofErr w:type="spellStart"/>
                         <w:r>
                           <w:rPr>
                             <w:sz w:val="18"/>
                           </w:rPr>
                           <w:t>VATAmount_VATClauseLine</w:t>
                         </w:r>
-                        <w:proofErr w:type="spellEnd"/>
                       </w:p>
                     </w:tc>
                   </w:sdtContent>
@@ -3636,12 +3596,12 @@
               <w:tr>
                 <w:tblPrEx>
                   <w:tblBorders>
-                    <w:top w:val="single" w:color="auto" w:sz="4" w:space="0"/>
-                    <w:left w:val="single" w:color="auto" w:sz="4" w:space="0"/>
-                    <w:bottom w:val="single" w:color="auto" w:sz="4" w:space="0"/>
-                    <w:right w:val="single" w:color="auto" w:sz="4" w:space="0"/>
-                    <w:insideH w:val="single" w:color="auto" w:sz="4" w:space="0"/>
-                    <w:insideV w:val="single" w:color="auto" w:sz="4" w:space="0"/>
+                    <w:top w:val="single" w:sz="4" w:space="0" w:color="auto"/>
+                    <w:left w:val="single" w:sz="4" w:space="0" w:color="auto"/>
+                    <w:bottom w:val="single" w:sz="4" w:space="0" w:color="auto"/>
+                    <w:right w:val="single" w:sz="4" w:space="0" w:color="auto"/>
+                    <w:insideH w:val="single" w:sz="4" w:space="0" w:color="auto"/>
+                    <w:insideV w:val="single" w:sz="4" w:space="0" w:color="auto"/>
                   </w:tblBorders>
                   <w:tblCellMar>
                     <w:left w:w="108" w:type="dxa"/>
@@ -3814,7 +3774,7 @@
     <w:sdt>
       <w:sdtPr>
         <w:rPr>
-          <w:rFonts w:ascii="Calibri" w:hAnsi="Calibri" w:eastAsia="Calibri" w:cs="Times New Roman"/>
+          <w:rFonts w:ascii="Calibri" w:eastAsia="Calibri" w:hAnsi="Calibri" w:cs="Times New Roman"/>
           <w:color w:val="0070C0"/>
           <w:szCs w:val="16"/>
           <w:u w:val="single"/>
@@ -3829,7 +3789,7 @@
         <w:sdt>
           <w:sdtPr>
             <w:rPr>
-              <w:rFonts w:ascii="Calibri" w:hAnsi="Calibri" w:eastAsia="Calibri" w:cs="Times New Roman"/>
+              <w:rFonts w:ascii="Calibri" w:eastAsia="Calibri" w:hAnsi="Calibri" w:cs="Times New Roman"/>
               <w:color w:val="0070C0"/>
               <w:szCs w:val="16"/>
               <w:u w:val="single"/>
@@ -3986,12 +3946,12 @@
       <w:tblW w:w="5000" w:type="pct"/>
       <w:tblCellSpacing w:w="11" w:type="dxa"/>
       <w:tblBorders>
-        <w:top w:val="none" w:color="auto" w:sz="0" w:space="0"/>
-        <w:left w:val="none" w:color="auto" w:sz="0" w:space="0"/>
-        <w:bottom w:val="none" w:color="auto" w:sz="0" w:space="0"/>
-        <w:right w:val="none" w:color="auto" w:sz="0" w:space="0"/>
-        <w:insideH w:val="none" w:color="auto" w:sz="0" w:space="0"/>
-        <w:insideV w:val="none" w:color="auto" w:sz="0" w:space="0"/>
+        <w:top w:val="none" w:sz="0" w:space="0" w:color="auto"/>
+        <w:left w:val="none" w:sz="0" w:space="0" w:color="auto"/>
+        <w:bottom w:val="none" w:sz="0" w:space="0" w:color="auto"/>
+        <w:right w:val="none" w:sz="0" w:space="0" w:color="auto"/>
+        <w:insideH w:val="none" w:sz="0" w:space="0" w:color="auto"/>
+        <w:insideV w:val="none" w:sz="0" w:space="0" w:color="auto"/>
       </w:tblBorders>
       <w:tblCellMar>
         <w:left w:w="0" w:type="dxa"/>
@@ -4017,12 +3977,12 @@
             <w:tblStyle w:val="TableGrid"/>
             <w:tblW w:w="5000" w:type="pct"/>
             <w:tblBorders>
-              <w:top w:val="none" w:color="auto" w:sz="0" w:space="0"/>
-              <w:left w:val="none" w:color="auto" w:sz="0" w:space="0"/>
-              <w:bottom w:val="none" w:color="auto" w:sz="0" w:space="0"/>
-              <w:right w:val="none" w:color="auto" w:sz="0" w:space="0"/>
-              <w:insideH w:val="none" w:color="auto" w:sz="0" w:space="0"/>
-              <w:insideV w:val="none" w:color="auto" w:sz="0" w:space="0"/>
+              <w:top w:val="none" w:sz="0" w:space="0" w:color="auto"/>
+              <w:left w:val="none" w:sz="0" w:space="0" w:color="auto"/>
+              <w:bottom w:val="none" w:sz="0" w:space="0" w:color="auto"/>
+              <w:right w:val="none" w:sz="0" w:space="0" w:color="auto"/>
+              <w:insideH w:val="none" w:sz="0" w:space="0" w:color="auto"/>
+              <w:insideV w:val="none" w:sz="0" w:space="0" w:color="auto"/>
             </w:tblBorders>
             <w:tblCellMar>
               <w:left w:w="0" w:type="dxa"/>
@@ -4104,12 +4064,12 @@
       <w:tblStyle w:val="TableGrid"/>
       <w:tblW w:w="5000" w:type="pct"/>
       <w:tblBorders>
-        <w:top w:val="none" w:color="auto" w:sz="0" w:space="0"/>
-        <w:left w:val="none" w:color="auto" w:sz="0" w:space="0"/>
-        <w:bottom w:val="none" w:color="auto" w:sz="0" w:space="0"/>
-        <w:right w:val="none" w:color="auto" w:sz="0" w:space="0"/>
-        <w:insideH w:val="none" w:color="auto" w:sz="0" w:space="0"/>
-        <w:insideV w:val="none" w:color="auto" w:sz="0" w:space="0"/>
+        <w:top w:val="none" w:sz="0" w:space="0" w:color="auto"/>
+        <w:left w:val="none" w:sz="0" w:space="0" w:color="auto"/>
+        <w:bottom w:val="none" w:sz="0" w:space="0" w:color="auto"/>
+        <w:right w:val="none" w:sz="0" w:space="0" w:color="auto"/>
+        <w:insideH w:val="none" w:sz="0" w:space="0" w:color="auto"/>
+        <w:insideV w:val="none" w:sz="0" w:space="0" w:color="auto"/>
       </w:tblBorders>
       <w:tblLayout w:type="fixed"/>
       <w:tblCellMar>
@@ -4733,12 +4693,12 @@
       <w:tblStyle w:val="TableGrid"/>
       <w:tblW w:w="5000" w:type="pct"/>
       <w:tblBorders>
-        <w:top w:val="none" w:color="auto" w:sz="0" w:space="0"/>
-        <w:left w:val="none" w:color="auto" w:sz="0" w:space="0"/>
-        <w:bottom w:val="none" w:color="auto" w:sz="0" w:space="0"/>
-        <w:right w:val="none" w:color="auto" w:sz="0" w:space="0"/>
-        <w:insideH w:val="none" w:color="auto" w:sz="0" w:space="0"/>
-        <w:insideV w:val="none" w:color="auto" w:sz="0" w:space="0"/>
+        <w:top w:val="none" w:sz="0" w:space="0" w:color="auto"/>
+        <w:left w:val="none" w:sz="0" w:space="0" w:color="auto"/>
+        <w:bottom w:val="none" w:sz="0" w:space="0" w:color="auto"/>
+        <w:right w:val="none" w:sz="0" w:space="0" w:color="auto"/>
+        <w:insideH w:val="none" w:sz="0" w:space="0" w:color="auto"/>
+        <w:insideV w:val="none" w:sz="0" w:space="0" w:color="auto"/>
       </w:tblBorders>
       <w:tblCellMar>
         <w:left w:w="0" w:type="dxa"/>
@@ -4778,7 +4738,6 @@
               <w:text/>
             </w:sdtPr>
             <w:sdtContent>
-              <w:proofErr w:type="spellStart"/>
               <w:r>
                 <w:rPr>
                   <w:rStyle w:val="Strong"/>
@@ -4786,7 +4745,6 @@
                 </w:rPr>
                 <w:t>DocumentTitle_Lbl</w:t>
               </w:r>
-              <w:proofErr w:type="spellEnd"/>
             </w:sdtContent>
           </w:sdt>
           <w:r>
@@ -4812,7 +4770,6 @@
               <w:text/>
             </w:sdtPr>
             <w:sdtContent>
-              <w:proofErr w:type="spellStart"/>
               <w:r>
                 <w:rPr>
                   <w:rStyle w:val="Strong"/>
@@ -4820,7 +4777,6 @@
                 </w:rPr>
                 <w:t>DocumentNo</w:t>
               </w:r>
-              <w:proofErr w:type="spellEnd"/>
             </w:sdtContent>
           </w:sdt>
         </w:p>
@@ -4846,14 +4802,12 @@
                   <w:lang w:val="it-IT"/>
                 </w:rPr>
               </w:pPr>
-              <w:proofErr w:type="spellStart"/>
               <w:r>
                 <w:rPr>
                   <w:lang w:val="it-IT"/>
                 </w:rPr>
                 <w:t>DocumentDate</w:t>
               </w:r>
-              <w:proofErr w:type="spellEnd"/>
             </w:p>
           </w:sdtContent>
         </w:sdt>
@@ -4880,14 +4834,12 @@
               <w:text/>
             </w:sdtPr>
             <w:sdtContent>
-              <w:proofErr w:type="spellStart"/>
               <w:r>
                 <w:rPr>
                   <w:lang w:val="it-IT"/>
                 </w:rPr>
                 <w:t>Page_Lbl</w:t>
               </w:r>
-              <w:proofErr w:type="spellEnd"/>
             </w:sdtContent>
           </w:sdt>
           <w:r>
@@ -5003,18 +4955,18 @@
 </file>
 
 <file path=word/header2.xml><?xml version="1.0" encoding="utf-8"?>
-<w:hdr xmlns:a="http://schemas.openxmlformats.org/drawingml/2006/main" xmlns:pic="http://schemas.openxmlformats.org/drawingml/2006/picture" xmlns:wpc="http://schemas.microsoft.com/office/word/2010/wordprocessingCanvas" xmlns:cx="http://schemas.microsoft.com/office/drawing/2014/chartex" xmlns:cx1="http://schemas.microsoft.com/office/drawing/2015/9/8/chartex" xmlns:cx2="http://schemas.microsoft.com/office/drawing/2015/10/21/chartex" xmlns:cx3="http://schemas.microsoft.com/office/drawing/2016/5/9/chartex" xmlns:cx4="http://schemas.microsoft.com/office/drawing/2016/5/10/chartex" xmlns:cx5="http://schemas.microsoft.com/office/drawing/2016/5/11/chartex" xmlns:cx6="http://schemas.microsoft.com/office/drawing/2016/5/12/chartex" xmlns:cx7="http://schemas.microsoft.com/office/drawing/2016/5/13/chartex" xmlns:cx8="http://schemas.microsoft.com/office/drawing/2016/5/14/chartex" xmlns:mc="http://schemas.openxmlformats.org/markup-compatibility/2006" xmlns:aink="http://schemas.microsoft.com/office/drawing/2016/ink" xmlns:am3d="http://schemas.microsoft.com/office/drawing/2017/model3d" xmlns:o="urn:schemas-microsoft-com:office:office" xmlns:oel="http://schemas.microsoft.com/office/2019/extlst" xmlns:r="http://schemas.openxmlformats.org/officeDocument/2006/relationships" xmlns:m="http://schemas.openxmlformats.org/officeDocument/2006/math" xmlns:v="urn:schemas-microsoft-com:vml" xmlns:wp14="http://schemas.microsoft.com/office/word/2010/wordprocessingDrawing" xmlns:wp="http://schemas.openxmlformats.org/drawingml/2006/wordprocessingDrawing" xmlns:w10="urn:schemas-microsoft-com:office:word" xmlns:w="http://schemas.openxmlformats.org/wordprocessingml/2006/main" xmlns:w14="http://schemas.microsoft.com/office/word/2010/wordml" xmlns:w15="http://schemas.microsoft.com/office/word/2012/wordml" xmlns:w16cex="http://schemas.microsoft.com/office/word/2018/wordml/cex" xmlns:w16cid="http://schemas.microsoft.com/office/word/2016/wordml/cid" xmlns:w16="http://schemas.microsoft.com/office/word/2018/wordml" xmlns:w16du="http://schemas.microsoft.com/office/word/2023/wordml/word16du" xmlns:w16sdtdh="http://schemas.microsoft.com/office/word/2020/wordml/sdtdatahash" xmlns:w16sdtfl="http://schemas.microsoft.com/office/word/2024/wordml/sdtformatlock" xmlns:w16se="http://schemas.microsoft.com/office/word/2015/wordml/symex" xmlns:wpg="http://schemas.microsoft.com/office/word/2010/wordprocessingGroup" xmlns:wpi="http://schemas.microsoft.com/office/word/2010/wordprocessingInk" xmlns:wne="http://schemas.microsoft.com/office/word/2006/wordml" xmlns:wps="http://schemas.microsoft.com/office/word/2010/wordprocessingShape" mc:Ignorable="w14 w15 w16se w16cid w16 w16cex w16sdtdh w16sdtfl w16du wp14">
+<w:hdr xmlns:wpc="http://schemas.microsoft.com/office/word/2010/wordprocessingCanvas" xmlns:cx="http://schemas.microsoft.com/office/drawing/2014/chartex" xmlns:cx1="http://schemas.microsoft.com/office/drawing/2015/9/8/chartex" xmlns:cx2="http://schemas.microsoft.com/office/drawing/2015/10/21/chartex" xmlns:cx3="http://schemas.microsoft.com/office/drawing/2016/5/9/chartex" xmlns:cx4="http://schemas.microsoft.com/office/drawing/2016/5/10/chartex" xmlns:cx5="http://schemas.microsoft.com/office/drawing/2016/5/11/chartex" xmlns:cx6="http://schemas.microsoft.com/office/drawing/2016/5/12/chartex" xmlns:cx7="http://schemas.microsoft.com/office/drawing/2016/5/13/chartex" xmlns:cx8="http://schemas.microsoft.com/office/drawing/2016/5/14/chartex" xmlns:mc="http://schemas.openxmlformats.org/markup-compatibility/2006" xmlns:aink="http://schemas.microsoft.com/office/drawing/2016/ink" xmlns:am3d="http://schemas.microsoft.com/office/drawing/2017/model3d" xmlns:o="urn:schemas-microsoft-com:office:office" xmlns:oel="http://schemas.microsoft.com/office/2019/extlst" xmlns:r="http://schemas.openxmlformats.org/officeDocument/2006/relationships" xmlns:m="http://schemas.openxmlformats.org/officeDocument/2006/math" xmlns:v="urn:schemas-microsoft-com:vml" xmlns:wp14="http://schemas.microsoft.com/office/word/2010/wordprocessingDrawing" xmlns:wp="http://schemas.openxmlformats.org/drawingml/2006/wordprocessingDrawing" xmlns:w10="urn:schemas-microsoft-com:office:word" xmlns:w="http://schemas.openxmlformats.org/wordprocessingml/2006/main" xmlns:w14="http://schemas.microsoft.com/office/word/2010/wordml" xmlns:w15="http://schemas.microsoft.com/office/word/2012/wordml" xmlns:w16cex="http://schemas.microsoft.com/office/word/2018/wordml/cex" xmlns:w16cid="http://schemas.microsoft.com/office/word/2016/wordml/cid" xmlns:w16="http://schemas.microsoft.com/office/word/2018/wordml" xmlns:w16du="http://schemas.microsoft.com/office/word/2023/wordml/word16du" xmlns:w16sdtdh="http://schemas.microsoft.com/office/word/2020/wordml/sdtdatahash" xmlns:w16sdtfl="http://schemas.microsoft.com/office/word/2024/wordml/sdtformatlock" xmlns:w16se="http://schemas.microsoft.com/office/word/2015/wordml/symex" xmlns:wpg="http://schemas.microsoft.com/office/word/2010/wordprocessingGroup" xmlns:wpi="http://schemas.microsoft.com/office/word/2010/wordprocessingInk" xmlns:wne="http://schemas.microsoft.com/office/word/2006/wordml" xmlns:wps="http://schemas.microsoft.com/office/word/2010/wordprocessingShape" mc:Ignorable="w14 w15 w16se w16cid w16 w16cex w16sdtdh w16sdtfl w16du wp14">
   <w:tbl>
     <w:tblPr>
       <w:tblStyle w:val="TableGrid"/>
       <w:tblW w:w="5000" w:type="pct"/>
       <w:tblBorders>
-        <w:top w:val="none" w:color="auto" w:sz="0" w:space="0"/>
-        <w:left w:val="none" w:color="auto" w:sz="0" w:space="0"/>
-        <w:bottom w:val="none" w:color="auto" w:sz="0" w:space="0"/>
-        <w:right w:val="none" w:color="auto" w:sz="0" w:space="0"/>
-        <w:insideH w:val="none" w:color="auto" w:sz="0" w:space="0"/>
-        <w:insideV w:val="none" w:color="auto" w:sz="0" w:space="0"/>
+        <w:top w:val="none" w:sz="0" w:space="0" w:color="auto"/>
+        <w:left w:val="none" w:sz="0" w:space="0" w:color="auto"/>
+        <w:bottom w:val="none" w:sz="0" w:space="0" w:color="auto"/>
+        <w:right w:val="none" w:sz="0" w:space="0" w:color="auto"/>
+        <w:insideH w:val="none" w:sz="0" w:space="0" w:color="auto"/>
+        <w:insideV w:val="none" w:sz="0" w:space="0" w:color="auto"/>
       </w:tblBorders>
       <w:tblCellMar>
         <w:left w:w="0" w:type="dxa"/>
@@ -5053,14 +5005,12 @@
               <w:text/>
             </w:sdtPr>
             <w:sdtContent>
-              <w:proofErr w:type="spellStart"/>
               <w:r>
                 <w:rPr>
                   <w:lang w:val="it-IT"/>
                 </w:rPr>
                 <w:t>DocumentTitle_Lbl</w:t>
               </w:r>
-              <w:proofErr w:type="spellEnd"/>
             </w:sdtContent>
           </w:sdt>
           <w:r>
@@ -5084,14 +5034,12 @@
               <w:text/>
             </w:sdtPr>
             <w:sdtContent>
-              <w:proofErr w:type="spellStart"/>
               <w:r>
                 <w:rPr>
                   <w:lang w:val="it-IT"/>
                 </w:rPr>
                 <w:t>DocumentNo</w:t>
               </w:r>
-              <w:proofErr w:type="spellEnd"/>
             </w:sdtContent>
           </w:sdt>
         </w:p>
@@ -5117,14 +5065,12 @@
                   <w:lang w:val="it-IT"/>
                 </w:rPr>
               </w:pPr>
-              <w:proofErr w:type="spellStart"/>
               <w:r>
                 <w:rPr>
                   <w:lang w:val="it-IT"/>
                 </w:rPr>
                 <w:t>DocumentDate</w:t>
               </w:r>
-              <w:proofErr w:type="spellEnd"/>
             </w:p>
           </w:sdtContent>
         </w:sdt>
@@ -5151,14 +5097,12 @@
               <w:text/>
             </w:sdtPr>
             <w:sdtContent>
-              <w:proofErr w:type="spellStart"/>
               <w:r>
                 <w:rPr>
                   <w:lang w:val="it-IT"/>
                 </w:rPr>
                 <w:t>Page_Lbl</w:t>
               </w:r>
-              <w:proofErr w:type="spellEnd"/>
             </w:sdtContent>
           </w:sdt>
           <w:r>
@@ -7960,6 +7904,7 @@
     <w:rsid w:val="001D6FE3"/>
     <w:rsid w:val="001F6C15"/>
     <w:rsid w:val="0027442B"/>
+    <w:rsid w:val="00287F20"/>
     <w:rsid w:val="002A6E8F"/>
     <w:rsid w:val="002B3B07"/>
     <w:rsid w:val="002B6532"/>
@@ -7977,6 +7922,7 @@
     <w:rsid w:val="00507E0A"/>
     <w:rsid w:val="00591BD2"/>
     <w:rsid w:val="005E35BE"/>
+    <w:rsid w:val="006551F2"/>
     <w:rsid w:val="00781235"/>
     <w:rsid w:val="00784F9C"/>
     <w:rsid w:val="007F1293"/>
@@ -8000,11 +7946,13 @@
     <w:rsid w:val="00BF27CE"/>
     <w:rsid w:val="00C00597"/>
     <w:rsid w:val="00C03606"/>
+    <w:rsid w:val="00C926BA"/>
     <w:rsid w:val="00CB7A61"/>
     <w:rsid w:val="00CB7A74"/>
     <w:rsid w:val="00CC7327"/>
     <w:rsid w:val="00CD6CA3"/>
     <w:rsid w:val="00D52343"/>
+    <w:rsid w:val="00D905EC"/>
     <w:rsid w:val="00E90336"/>
     <w:rsid w:val="00ED5D68"/>
     <w:rsid w:val="00F635C5"/>
@@ -9220,9 +9168,7 @@
 <b:Sources xmlns:b="http://schemas.openxmlformats.org/officeDocument/2006/bibliography" xmlns="http://schemas.openxmlformats.org/officeDocument/2006/bibliography" SelectedStyle="\APASixthEditionOfficeOnline.xsl" StyleName="APA" Version="6"/>
 </file>
 
-<file path=customXml/item2.xml>��< ? x m l   v e r s i o n = " 1 . 0 "   e n c o d i n g = " u t f - 1 6 " ? > - 
- < N a v W o r d R e p o r t X m l P a r t   x m l n s = " u r n : m i c r o s o f t - d y n a m i c s - b u s i n e s s c e n t r a l / i n t e r n a l / e x t e n d e d / r e p o r t s / S t a n d a r d _ S a l e s _ I n v o i c e / 1 3 0 6 / " > +<file path=customXml/item2.xml>��< ? x m l   v e r s i o n = " 1 . 0 "   e n c o d i n g = " u t f - 1 6 " ? > < N a v W o r d R e p o r t X m l P a r t   x m l n s = " u r n : m i c r o s o f t - d y n a m i c s - b u s i n e s s c e n t r a l / i n t e r n a l / e x t e n d e d / r e p o r t s / S t a n d a r d _ S a l e s _ I n v o i c e / 1 3 0 6 / " >   
      < B C R e p o r t I n f o r m a t i o n >   
@@ -9780,7 +9726,7 @@
  
          < C o m p a n y P h o n e N o _ L b l   E l e m e n t T y p e = " C o l u m n "   E l e m e n t I d = " 5 5 8 5 9 3 5 8 6 "   D a t a T y p e = " L a b e l " > C o m p a n y P h o n e N o _ L b l < / C o m p a n y P h o n e N o _ L b l >   
-         < C o m p a n y P i c t u r e   E l e m e n t T y p e = " C o l u m n "   E l e m e n t I d = " 1 3 9 7 4 1 1 0 7 4 "   D a t a T y p e = " B l o b "   / > +         < C o m p a n y P i c t u r e   E l e m e n t T y p e = " C o l u m n "   E l e m e n t I d = " 1 3 9 7 4 1 1 0 7 4 "   D a t a T y p e = " B l o b " / >   
          < C o m p a n y R e g i s t r a t i o n N u m b e r   E l e m e n t T y p e = " C o l u m n "   E l e m e n t I d = " 2 0 2 3 6 3 9 4 2 4 "   D a t a T y p e = " T e x t " > C o m p a n y R e g i s t r a t i o n N u m b e r < / C o m p a n y R e g i s t r a t i o n N u m b e r >   
@@ -10206,7 +10152,7 @@
  
          < P a y m e n t R e p o r t i n g A r g u m e n t   E l e m e n t T y p e = " D a t a I t e m "   E l e m e n t I d = " 3 1 3 7 4 4 1 9 4 " >   
-             < P a y m e n t S e r v i c e L o g o   E l e m e n t T y p e = " C o l u m n "   E l e m e n t I d = " 4 1 6 7 9 0 7 6 7 "   D a t a T y p e = " B l o b "   / > +             < P a y m e n t S e r v i c e L o g o   E l e m e n t T y p e = " C o l u m n "   E l e m e n t I d = " 4 1 6 7 9 0 7 6 7 "   D a t a T y p e = " B l o b " / >   
              < P a y m e n t S e r v i c e L o g o _ U r l   E l e m e n t T y p e = " C o l u m n "   E l e m e n t I d = " 6 4 4 9 7 5 1 3 9 "   D a t a T y p e = " T e x t " > P a y m e n t S e r v i c e L o g o _ U r l < / P a y m e n t S e r v i c e L o g o _ U r l >   
@@ -10307,9 +10253,7 @@
  < / N a v W o r d R e p o r t X m l P a r t > 
 </file>
 
-<file path=customXml/item3.xml>��< ? x m l   v e r s i o n = " 1 . 0 "   e n c o d i n g = " u t f - 1 6 " ? > - 
- < N a v W o r d R e p o r t X m l P a r t   x m l n s = " u r n : m i c r o s o f t - d y n a m i c s - n a v / r e p o r t s / S t a n d a r d _ S a l e s _ I n v o i c e / 1 3 0 6 / " > +<file path=customXml/item3.xml>��< ? x m l   v e r s i o n = " 1 . 0 "   e n c o d i n g = " u t f - 1 6 " ? > < N a v W o r d R e p o r t X m l P a r t   x m l n s = " u r n : m i c r o s o f t - d y n a m i c s - n a v / r e p o r t s / S t a n d a r d _ S a l e s _ I n v o i c e / 1 3 0 6 / " >   
      < B C R e p o r t I n f o r m a t i o n >   
@@ -10533,7 +10477,7 @@
  
          < C o m p a n y P h o n e N o _ L b l > C o m p a n y P h o n e N o _ L b l < / C o m p a n y P h o n e N o _ L b l >   
-         < C o m p a n y P i c t u r e   / > +         < C o m p a n y P i c t u r e / >   
          < C o m p a n y R e g i s t r a t i o n N u m b e r > C o m p a n y R e g i s t r a t i o n N u m b e r < / C o m p a n y R e g i s t r a t i o n N u m b e r >   
@@ -10959,7 +10903,7 @@
  
          < P a y m e n t R e p o r t i n g A r g u m e n t >   
-             < P a y m e n t S e r v i c e L o g o   / > +             < P a y m e n t S e r v i c e L o g o / >   
              < P a y m e n t S e r v i c e L o g o _ U r l > P a y m e n t S e r v i c e L o g o _ U r l < / P a y m e n t S e r v i c e L o g o _ U r l >   

</xml_diff>